<commit_message>
Use plain formatting for the HW1 report
Drop the colored headings, shaded table headers and paper-style table
rules in both the Word and LaTeX versions so the report looks like a
normal homework write-up.

Co-Authored-By: Claude Opus 5.5 <noreply@anthropic.com>
</commit_message>
<xml_diff>
--- a/HW1/report/Asg1_413551034.docx
+++ b/HW1/report/Asg1_413551034.docx
@@ -11,7 +11,7 @@
         <w:rPr>
           <w:b/>
           <w:i w:val="0"/>
-          <w:sz w:val="30"/>
+          <w:sz w:val="26"/>
         </w:rPr>
         <w:t>Assignment 1: Analysis of SVD for Fine-Tuning LLMs</w:t>
       </w:r>
@@ -24,28 +24,20 @@
       <w:r>
         <w:rPr>
           <w:i w:val="0"/>
-          <w:sz w:val="20"/>
         </w:rPr>
-        <w:t>蕭至恆 (Student ID 413551034)  ·  Big Data Analytics Techniques and Applications, Fall 2026</w:t>
+        <w:t>蕭至恆 (Student ID 413551034)</w:t>
       </w:r>
     </w:p>
     <w:p>
       <w:pPr>
-        <w:spacing w:after="40"/>
+        <w:spacing w:after="80"/>
         <w:jc w:val="center"/>
       </w:pPr>
       <w:r>
         <w:rPr>
           <w:i w:val="0"/>
-          <w:sz w:val="20"/>
         </w:rPr>
-        <w:t xml:space="preserve">GitHub: </w:t>
-      </w:r>
-      <w:r>
-        <w:rPr>
-          <w:sz w:val="20"/>
-        </w:rPr>
-        <w:t>https://github.com/CH-Joshua-Hsiao/NYCU-BigDataAnalytics/tree/main/HW1</w:t>
+        <w:t>GitHub: https://github.com/CH-Joshua-Hsiao/NYCU-BigDataAnalytics/tree/main/HW1</w:t>
       </w:r>
     </w:p>
     <w:p>
@@ -54,25 +46,26 @@
       </w:pPr>
       <w:r>
         <w:rPr>
-          <w:i/>
-          <w:sz w:val="18"/>
+          <w:b/>
         </w:rPr>
-        <w:t>Setup: I fine-tuned Llama-3.2-1B with PiSSA on 25,000 MetaMathQA samples (1 epoch, learning rate 2e-5, batch size 128, FP16, all 7 projection layers). I tested on 1,000 GSM8K and 1,000 MATH questions. All runs used one RTX 3090 (24 GB) on my own computer, with micro-batch 4 and 32 accumulation steps. The SVD step ran on the CPU.</w:t>
+        <w:t xml:space="preserve">Setup: </w:t>
+      </w:r>
+      <w:r>
+        <w:rPr>
+          <w:i w:val="0"/>
+        </w:rPr>
+        <w:t>I fine-tuned Llama-3.2-1B with PiSSA on 25,000 MetaMathQA samples (1 epoch, learning rate 2e-5, batch size 128, FP16, all 7 projection layers). I tested on 1,000 GSM8K and 1,000 MATH questions. All runs used one RTX 3090 (24 GB) on my own computer, with micro-batch 4 and 32 accumulation steps. The SVD step ran on the CPU.</w:t>
       </w:r>
     </w:p>
     <w:p>
       <w:pPr>
         <w:keepNext/>
         <w:spacing w:before="120" w:after="40"/>
-        <w:pBdr>
-          <w:bottom w:val="single" w:sz="4" w:space="1" w:color="1F3A68"/>
-        </w:pBdr>
       </w:pPr>
       <w:r>
         <w:rPr>
           <w:b/>
-          <w:color w:val="1F3A68"/>
-          <w:sz w:val="23"/>
+          <w:sz w:val="22"/>
         </w:rPr>
         <w:t>Question 1: Accuracy of the original and fine-tuned models</w:t>
       </w:r>
@@ -85,17 +78,16 @@
         <w:tblLook w:firstColumn="1" w:firstRow="1" w:lastColumn="0" w:lastRow="0" w:noHBand="0" w:noVBand="1" w:val="04A0"/>
       </w:tblPr>
       <w:tblGrid>
-        <w:gridCol w:w="1973"/>
-        <w:gridCol w:w="1973"/>
-        <w:gridCol w:w="1973"/>
-        <w:gridCol w:w="1973"/>
-        <w:gridCol w:w="1973"/>
+        <w:gridCol w:w="1928"/>
+        <w:gridCol w:w="1928"/>
+        <w:gridCol w:w="1928"/>
+        <w:gridCol w:w="1928"/>
+        <w:gridCol w:w="1928"/>
       </w:tblGrid>
       <w:tr>
         <w:tc>
           <w:tcPr>
             <w:tcW w:type="dxa" w:w="1474"/>
-            <w:shd w:val="clear" w:color="auto" w:fill="DCE6F2"/>
           </w:tcPr>
           <w:p>
             <w:pPr>
@@ -115,7 +107,6 @@
         <w:tc>
           <w:tcPr>
             <w:tcW w:type="dxa" w:w="1814"/>
-            <w:shd w:val="clear" w:color="auto" w:fill="DCE6F2"/>
           </w:tcPr>
           <w:p>
             <w:pPr>
@@ -135,7 +126,6 @@
         <w:tc>
           <w:tcPr>
             <w:tcW w:type="dxa" w:w="2041"/>
-            <w:shd w:val="clear" w:color="auto" w:fill="DCE6F2"/>
           </w:tcPr>
           <w:p>
             <w:pPr>
@@ -155,7 +145,6 @@
         <w:tc>
           <w:tcPr>
             <w:tcW w:type="dxa" w:w="2041"/>
-            <w:shd w:val="clear" w:color="auto" w:fill="DCE6F2"/>
           </w:tcPr>
           <w:p>
             <w:pPr>
@@ -175,7 +164,6 @@
         <w:tc>
           <w:tcPr>
             <w:tcW w:type="dxa" w:w="2154"/>
-            <w:shd w:val="clear" w:color="auto" w:fill="DCE6F2"/>
           </w:tcPr>
           <w:p>
             <w:pPr>
@@ -438,17 +426,16 @@
         <w:tblLook w:firstColumn="1" w:firstRow="1" w:lastColumn="0" w:lastRow="0" w:noHBand="0" w:noVBand="1" w:val="04A0"/>
       </w:tblPr>
       <w:tblGrid>
-        <w:gridCol w:w="1973"/>
-        <w:gridCol w:w="1973"/>
-        <w:gridCol w:w="1973"/>
-        <w:gridCol w:w="1973"/>
-        <w:gridCol w:w="1973"/>
+        <w:gridCol w:w="1928"/>
+        <w:gridCol w:w="1928"/>
+        <w:gridCol w:w="1928"/>
+        <w:gridCol w:w="1928"/>
+        <w:gridCol w:w="1928"/>
       </w:tblGrid>
       <w:tr>
         <w:tc>
           <w:tcPr>
             <w:tcW w:type="dxa" w:w="2381"/>
-            <w:shd w:val="clear" w:color="auto" w:fill="DCE6F2"/>
           </w:tcPr>
           <w:p>
             <w:pPr>
@@ -468,7 +455,6 @@
         <w:tc>
           <w:tcPr>
             <w:tcW w:type="dxa" w:w="1644"/>
-            <w:shd w:val="clear" w:color="auto" w:fill="DCE6F2"/>
           </w:tcPr>
           <w:p>
             <w:pPr>
@@ -488,7 +474,6 @@
         <w:tc>
           <w:tcPr>
             <w:tcW w:type="dxa" w:w="1871"/>
-            <w:shd w:val="clear" w:color="auto" w:fill="DCE6F2"/>
           </w:tcPr>
           <w:p>
             <w:pPr>
@@ -508,7 +493,6 @@
         <w:tc>
           <w:tcPr>
             <w:tcW w:type="dxa" w:w="1871"/>
-            <w:shd w:val="clear" w:color="auto" w:fill="DCE6F2"/>
           </w:tcPr>
           <w:p>
             <w:pPr>
@@ -528,7 +512,6 @@
         <w:tc>
           <w:tcPr>
             <w:tcW w:type="dxa" w:w="1928"/>
-            <w:shd w:val="clear" w:color="auto" w:fill="DCE6F2"/>
           </w:tcPr>
           <w:p>
             <w:pPr>
@@ -757,15 +740,11 @@
       <w:pPr>
         <w:keepNext/>
         <w:spacing w:before="120" w:after="40"/>
-        <w:pBdr>
-          <w:bottom w:val="single" w:sz="4" w:space="1" w:color="1F3A68"/>
-        </w:pBdr>
       </w:pPr>
       <w:r>
         <w:rPr>
           <w:b/>
-          <w:color w:val="1F3A68"/>
-          <w:sz w:val="23"/>
+          <w:sz w:val="22"/>
         </w:rPr>
         <w:t>Question 2: Training time</w:t>
       </w:r>
@@ -778,16 +757,15 @@
         <w:tblLook w:firstColumn="1" w:firstRow="1" w:lastColumn="0" w:lastRow="0" w:noHBand="0" w:noVBand="1" w:val="04A0"/>
       </w:tblPr>
       <w:tblGrid>
-        <w:gridCol w:w="2466"/>
-        <w:gridCol w:w="2466"/>
-        <w:gridCol w:w="2466"/>
-        <w:gridCol w:w="2466"/>
+        <w:gridCol w:w="2409"/>
+        <w:gridCol w:w="2409"/>
+        <w:gridCol w:w="2409"/>
+        <w:gridCol w:w="2409"/>
       </w:tblGrid>
       <w:tr>
         <w:tc>
           <w:tcPr>
             <w:tcW w:type="dxa" w:w="2041"/>
-            <w:shd w:val="clear" w:color="auto" w:fill="DCE6F2"/>
           </w:tcPr>
           <w:p>
             <w:pPr>
@@ -806,7 +784,6 @@
         <w:tc>
           <w:tcPr>
             <w:tcW w:type="dxa" w:w="2381"/>
-            <w:shd w:val="clear" w:color="auto" w:fill="DCE6F2"/>
           </w:tcPr>
           <w:p>
             <w:pPr>
@@ -826,7 +803,6 @@
         <w:tc>
           <w:tcPr>
             <w:tcW w:type="dxa" w:w="2381"/>
-            <w:shd w:val="clear" w:color="auto" w:fill="DCE6F2"/>
           </w:tcPr>
           <w:p>
             <w:pPr>
@@ -846,7 +822,6 @@
         <w:tc>
           <w:tcPr>
             <w:tcW w:type="dxa" w:w="2381"/>
-            <w:shd w:val="clear" w:color="auto" w:fill="DCE6F2"/>
           </w:tcPr>
           <w:p>
             <w:pPr>
@@ -1054,15 +1029,11 @@
       <w:pPr>
         <w:keepNext/>
         <w:spacing w:before="120" w:after="40"/>
-        <w:pBdr>
-          <w:bottom w:val="single" w:sz="4" w:space="1" w:color="1F3A68"/>
-        </w:pBdr>
       </w:pPr>
       <w:r>
         <w:rPr>
           <w:b/>
-          <w:color w:val="1F3A68"/>
-          <w:sz w:val="23"/>
+          <w:sz w:val="22"/>
         </w:rPr>
         <w:t>Question 3: Fine-tuning different singular-value ranges (rank 16)</w:t>
       </w:r>
@@ -1114,17 +1085,16 @@
         <w:tblLook w:firstColumn="1" w:firstRow="1" w:lastColumn="0" w:lastRow="0" w:noHBand="0" w:noVBand="1" w:val="04A0"/>
       </w:tblPr>
       <w:tblGrid>
-        <w:gridCol w:w="1973"/>
-        <w:gridCol w:w="1973"/>
-        <w:gridCol w:w="1973"/>
-        <w:gridCol w:w="1973"/>
-        <w:gridCol w:w="1973"/>
+        <w:gridCol w:w="1928"/>
+        <w:gridCol w:w="1928"/>
+        <w:gridCol w:w="1928"/>
+        <w:gridCol w:w="1928"/>
+        <w:gridCol w:w="1928"/>
       </w:tblGrid>
       <w:tr>
         <w:tc>
           <w:tcPr>
             <w:tcW w:type="dxa" w:w="1474"/>
-            <w:shd w:val="clear" w:color="auto" w:fill="DCE6F2"/>
           </w:tcPr>
           <w:p>
             <w:pPr>
@@ -1144,7 +1114,6 @@
         <w:tc>
           <w:tcPr>
             <w:tcW w:type="dxa" w:w="1928"/>
-            <w:shd w:val="clear" w:color="auto" w:fill="DCE6F2"/>
           </w:tcPr>
           <w:p>
             <w:pPr>
@@ -1164,7 +1133,6 @@
         <w:tc>
           <w:tcPr>
             <w:tcW w:type="dxa" w:w="1928"/>
-            <w:shd w:val="clear" w:color="auto" w:fill="DCE6F2"/>
           </w:tcPr>
           <w:p>
             <w:pPr>
@@ -1184,7 +1152,6 @@
         <w:tc>
           <w:tcPr>
             <w:tcW w:type="dxa" w:w="1928"/>
-            <w:shd w:val="clear" w:color="auto" w:fill="DCE6F2"/>
           </w:tcPr>
           <w:p>
             <w:pPr>
@@ -1204,7 +1171,6 @@
         <w:tc>
           <w:tcPr>
             <w:tcW w:type="dxa" w:w="1928"/>
-            <w:shd w:val="clear" w:color="auto" w:fill="DCE6F2"/>
           </w:tcPr>
           <w:p>
             <w:pPr>
@@ -1463,15 +1429,11 @@
       <w:pPr>
         <w:keepNext/>
         <w:spacing w:before="120" w:after="40"/>
-        <w:pBdr>
-          <w:bottom w:val="single" w:sz="4" w:space="1" w:color="1F3A68"/>
-        </w:pBdr>
       </w:pPr>
       <w:r>
         <w:rPr>
           <w:b/>
-          <w:color w:val="1F3A68"/>
-          <w:sz w:val="23"/>
+          <w:sz w:val="22"/>
         </w:rPr>
         <w:t>Question 4: SVD of q_proj in the original model (layers 0, 7, 15)</w:t>
       </w:r>
@@ -1484,16 +1446,15 @@
         <w:tblLook w:firstColumn="1" w:firstRow="1" w:lastColumn="0" w:lastRow="0" w:noHBand="0" w:noVBand="1" w:val="04A0"/>
       </w:tblPr>
       <w:tblGrid>
-        <w:gridCol w:w="2466"/>
-        <w:gridCol w:w="2466"/>
-        <w:gridCol w:w="2466"/>
-        <w:gridCol w:w="2466"/>
+        <w:gridCol w:w="2409"/>
+        <w:gridCol w:w="2409"/>
+        <w:gridCol w:w="2409"/>
+        <w:gridCol w:w="2409"/>
       </w:tblGrid>
       <w:tr>
         <w:tc>
           <w:tcPr>
             <w:tcW w:type="dxa" w:w="2948"/>
-            <w:shd w:val="clear" w:color="auto" w:fill="DCE6F2"/>
           </w:tcPr>
           <w:p>
             <w:pPr>
@@ -1512,7 +1473,6 @@
         <w:tc>
           <w:tcPr>
             <w:tcW w:type="dxa" w:w="2041"/>
-            <w:shd w:val="clear" w:color="auto" w:fill="DCE6F2"/>
           </w:tcPr>
           <w:p>
             <w:pPr>
@@ -1532,7 +1492,6 @@
         <w:tc>
           <w:tcPr>
             <w:tcW w:type="dxa" w:w="2041"/>
-            <w:shd w:val="clear" w:color="auto" w:fill="DCE6F2"/>
           </w:tcPr>
           <w:p>
             <w:pPr>
@@ -1552,7 +1511,6 @@
         <w:tc>
           <w:tcPr>
             <w:tcW w:type="dxa" w:w="2041"/>
-            <w:shd w:val="clear" w:color="auto" w:fill="DCE6F2"/>
           </w:tcPr>
           <w:p>
             <w:pPr>
@@ -1808,8 +1766,8 @@
         <w:tblLook w:firstColumn="1" w:firstRow="1" w:lastColumn="0" w:lastRow="0" w:noHBand="0" w:noVBand="1" w:val="04A0"/>
       </w:tblPr>
       <w:tblGrid>
-        <w:gridCol w:w="4933"/>
-        <w:gridCol w:w="4933"/>
+        <w:gridCol w:w="4819"/>
+        <w:gridCol w:w="4819"/>
       </w:tblGrid>
       <w:tr>
         <w:tc>
@@ -2095,8 +2053,8 @@
       </w:pPr>
       <w:r>
         <w:rPr>
-          <w:i/>
-          <w:sz w:val="17"/>
+          <w:i w:val="0"/>
+          <w:sz w:val="18"/>
         </w:rPr>
         <w:t>Left: singular value magnitude (bar chart). Right: cumulative energy (line chart). Only the first 200 of 2,048 singular values are shown. Energy = Σσᵢ² / Σσ². The dashed line is 50%.</w:t>
       </w:r>
@@ -2148,7 +2106,7 @@
     </w:p>
     <w:sectPr>
       <w:pgSz w:w="11906" w:h="16838"/>
-      <w:pgMar w:top="850" w:right="1020" w:bottom="850" w:left="1020" w:header="720" w:footer="720" w:gutter="0"/>
+      <w:pgMar w:top="1134" w:right="1134" w:bottom="1134" w:left="1134" w:header="720" w:footer="720" w:gutter="0"/>
       <w:cols w:space="720"/>
       <w:docGrid w:linePitch="360"/>
     </w:sectPr>

</xml_diff>